<commit_message>
fix: payslip template add dynamic bonus
</commit_message>
<xml_diff>
--- a/backend/src/template/payslip_template.docx
+++ b/backend/src/template/payslip_template.docx
@@ -48,9 +48,9 @@
                             <a:avLst/>
                             <a:gdLst>
                               <a:gd name="textAreaLeft" fmla="*/ 0 w 544320"/>
-                              <a:gd name="textAreaRight" fmla="*/ 546120 w 544320"/>
+                              <a:gd name="textAreaRight" fmla="*/ 546480 w 544320"/>
                               <a:gd name="textAreaTop" fmla="*/ 0 h 290520"/>
-                              <a:gd name="textAreaBottom" fmla="*/ 292320 h 290520"/>
+                              <a:gd name="textAreaBottom" fmla="*/ 292680 h 290520"/>
                             </a:gdLst>
                             <a:ahLst/>
                             <a:cxnLst/>
@@ -569,10 +569,10 @@
           <w:pgSz w:w="11906" w:h="16838"/>
           <w:pgMar w:left="1559" w:right="708" w:gutter="0" w:header="0" w:top="620" w:footer="0" w:bottom="0"/>
           <w:cols w:num="4" w:equalWidth="false" w:sep="false">
-            <w:col w:w="1435" w:space="40"/>
-            <w:col w:w="1597" w:space="1510"/>
-            <w:col w:w="1199" w:space="38"/>
-            <w:col w:w="3818"/>
+            <w:col w:w="1434" w:space="40"/>
+            <w:col w:w="1596" w:space="1510"/>
+            <w:col w:w="1198" w:space="38"/>
+            <w:col w:w="3820"/>
           </w:cols>
           <w:formProt w:val="false"/>
           <w:textDirection w:val="lrTb"/>
@@ -630,9 +630,9 @@
                           <a:avLst/>
                           <a:gdLst>
                             <a:gd name="textAreaLeft" fmla="*/ 0 w 2577600"/>
-                            <a:gd name="textAreaRight" fmla="*/ 2579400 w 2577600"/>
+                            <a:gd name="textAreaRight" fmla="*/ 2579760 w 2577600"/>
                             <a:gd name="textAreaTop" fmla="*/ 0 h 290520"/>
-                            <a:gd name="textAreaBottom" fmla="*/ 292320 h 290520"/>
+                            <a:gd name="textAreaBottom" fmla="*/ 292680 h 290520"/>
                           </a:gdLst>
                           <a:ahLst/>
                           <a:cxnLst/>
@@ -721,9 +721,9 @@
                             <a:avLst/>
                             <a:gdLst>
                               <a:gd name="textAreaLeft" fmla="*/ 0 w 4286520"/>
-                              <a:gd name="textAreaRight" fmla="*/ 4288320 w 4286520"/>
+                              <a:gd name="textAreaRight" fmla="*/ 4288680 w 4286520"/>
                               <a:gd name="textAreaTop" fmla="*/ 0 h 424440"/>
-                              <a:gd name="textAreaBottom" fmla="*/ 426240 h 424440"/>
+                              <a:gd name="textAreaBottom" fmla="*/ 426600 h 424440"/>
                             </a:gdLst>
                             <a:ahLst/>
                             <a:cxnLst/>
@@ -776,7 +776,7 @@
                         <pic:spPr>
                           <a:xfrm>
                             <a:off x="1063800" y="105480"/>
-                            <a:ext cx="536400" cy="533520"/>
+                            <a:ext cx="536040" cy="533520"/>
                           </a:xfrm>
                           <a:prstGeom prst="rect">
                             <a:avLst/>
@@ -929,7 +929,7 @@
                   <v:path o:extrusionok="f" gradientshapeok="t" o:connecttype="rect"/>
                   <o:lock v:ext="edit" aspectratio="t"/>
                 </v:shapetype>
-                <v:shape id="shape_0" ID="Image 7" stroked="f" o:allowincell="f" style="position:absolute;left:1675;top:15826;width:844;height:839;mso-wrap-style:none;v-text-anchor:middle;mso-position-horizontal-relative:page;mso-position-vertical-relative:page" type="_x0000_t75">
+                <v:shape id="shape_0" ID="Image 7" stroked="f" o:allowincell="f" style="position:absolute;left:1675;top:15826;width:843;height:839;mso-wrap-style:none;v-text-anchor:middle;mso-position-horizontal-relative:page;mso-position-vertical-relative:page" type="_x0000_t75">
                   <v:imagedata r:id="rId5" o:detectmouseclick="t"/>
                   <v:stroke color="#3465a4" joinstyle="round" endcap="flat"/>
                   <w10:wrap type="none"/>
@@ -1611,6 +1611,110 @@
       </w:tr>
       <w:tr>
         <w:trPr>
+          <w:trHeight w:val="261" w:hRule="atLeast"/>
+        </w:trPr>
+        <w:tc>
+          <w:tcPr>
+            <w:tcW w:w="2070" w:type="dxa"/>
+            <w:tcBorders>
+              <w:bottom w:val="single" w:sz="12" w:space="0" w:color="FFFFFF"/>
+            </w:tcBorders>
+          </w:tcPr>
+          <w:p>
+            <w:pPr>
+              <w:pStyle w:val="TableParagraph"/>
+              <w:spacing w:before="18" w:after="0"/>
+              <w:ind w:left="37"/>
+              <w:rPr>
+                <w:sz w:val="20"/>
+              </w:rPr>
+            </w:pPr>
+            <w:r>
+              <w:rPr>
+                <w:sz w:val="20"/>
+              </w:rPr>
+              <w:t>{Bonus}</w:t>
+            </w:r>
+          </w:p>
+        </w:tc>
+        <w:tc>
+          <w:tcPr>
+            <w:tcW w:w="2010" w:type="dxa"/>
+            <w:tcBorders>
+              <w:bottom w:val="single" w:sz="12" w:space="0" w:color="FFFFFF"/>
+              <w:right w:val="single" w:sz="12" w:space="0" w:color="FFFFFF"/>
+            </w:tcBorders>
+          </w:tcPr>
+          <w:p>
+            <w:pPr>
+              <w:pStyle w:val="TableParagraph"/>
+              <w:spacing w:before="18" w:after="0"/>
+              <w:ind w:right="5"/>
+              <w:jc w:val="right"/>
+              <w:rPr>
+                <w:sz w:val="20"/>
+              </w:rPr>
+            </w:pPr>
+            <w:r>
+              <w:rPr>
+                <w:sz w:val="20"/>
+              </w:rPr>
+              <w:t>{bonus}</w:t>
+            </w:r>
+          </w:p>
+        </w:tc>
+        <w:tc>
+          <w:tcPr>
+            <w:tcW w:w="2142" w:type="dxa"/>
+            <w:tcBorders>
+              <w:left w:val="single" w:sz="12" w:space="0" w:color="FFFFFF"/>
+              <w:bottom w:val="single" w:sz="12" w:space="0" w:color="FFFFFF"/>
+            </w:tcBorders>
+          </w:tcPr>
+          <w:p>
+            <w:pPr>
+              <w:pStyle w:val="TableParagraph"/>
+              <w:spacing w:before="18" w:after="0"/>
+              <w:ind w:left="34"/>
+              <w:rPr>
+                <w:sz w:val="20"/>
+              </w:rPr>
+            </w:pPr>
+            <w:r>
+              <w:rPr>
+                <w:sz w:val="20"/>
+              </w:rPr>
+            </w:r>
+          </w:p>
+        </w:tc>
+        <w:tc>
+          <w:tcPr>
+            <w:tcW w:w="1950" w:type="dxa"/>
+            <w:tcBorders>
+              <w:bottom w:val="single" w:sz="12" w:space="0" w:color="FFFFFF"/>
+              <w:right w:val="single" w:sz="12" w:space="0" w:color="FFFFFF"/>
+            </w:tcBorders>
+          </w:tcPr>
+          <w:p>
+            <w:pPr>
+              <w:pStyle w:val="TableParagraph"/>
+              <w:spacing w:before="18" w:after="0"/>
+              <w:ind w:right="6"/>
+              <w:jc w:val="right"/>
+              <w:rPr>
+                <w:sz w:val="20"/>
+              </w:rPr>
+            </w:pPr>
+            <w:r>
+              <w:rPr>
+                <w:sz w:val="20"/>
+              </w:rPr>
+            </w:r>
+          </w:p>
+        </w:tc>
+      </w:tr>
+      <w:tr>
+        <w:trPr>
           <w:trHeight w:val="260" w:hRule="atLeast"/>
         </w:trPr>
         <w:tc>
@@ -1623,6 +1727,22 @@
               <w:right w:val="single" w:sz="12" w:space="0" w:color="FFFFFF"/>
             </w:tcBorders>
           </w:tcPr>
+          <w:p>
+            <w:pPr>
+              <w:pStyle w:val="TableParagraph"/>
+              <w:spacing w:lineRule="auto" w:line="240" w:before="0" w:after="0"/>
+              <w:rPr>
+                <w:rFonts w:ascii="Times New Roman" w:hAnsi="Times New Roman"/>
+                <w:sz w:val="18"/>
+              </w:rPr>
+            </w:pPr>
+            <w:r>
+              <w:rPr>
+                <w:rFonts w:ascii="Times New Roman" w:hAnsi="Times New Roman"/>
+                <w:sz w:val="18"/>
+              </w:rPr>
+            </w:r>
+          </w:p>
           <w:p>
             <w:pPr>
               <w:pStyle w:val="TableParagraph"/>
@@ -2578,15 +2698,15 @@
     </w:pPr>
     <w:rPr/>
   </w:style>
-  <w:style w:type="paragraph" w:styleId="FrameContents">
-    <w:name w:val="Frame Contents"/>
+  <w:style w:type="paragraph" w:styleId="FrameContentsuser">
+    <w:name w:val="Frame Contents (user)"/>
     <w:basedOn w:val="Normal"/>
     <w:qFormat/>
     <w:pPr/>
     <w:rPr/>
   </w:style>
-  <w:style w:type="paragraph" w:styleId="FrameContentsuser">
-    <w:name w:val="Frame Contents (user)"/>
+  <w:style w:type="paragraph" w:styleId="FrameContents">
+    <w:name w:val="Frame Contents"/>
     <w:basedOn w:val="Normal"/>
     <w:qFormat/>
     <w:pPr/>

</xml_diff>